<commit_message>
docs(harvyrd): fix Popol Wuj layout and archive prior edition
</commit_message>
<xml_diff>
--- a/book-collections/HARVYRD/harvyrd-popol-wuj-v0.1/Popol-Vuh-RU.docx
+++ b/book-collections/HARVYRD/harvyrd-popol-wuj-v0.1/Popol-Vuh-RU.docx
@@ -250,16 +250,6 @@
       </w:r>
     </w:p>
     <w:p>
-      <w:r>
-        <w:rPr>
-          <w:rFonts w:ascii="Noto Serif" w:hAnsi="Noto Serif" w:eastAsia="Noto Serif"/>
-          <w:color w:val="252B42"/>
-          <w:sz w:val="21"/>
-        </w:rPr>
-        <w:t>К Popol Wuj относятся с глубоким уважением многие K’iche’ и другие Maya люди. Поэтому здесь нет инструкций, реконструкций закрытых обрядов или претензии объяснить одну «религию Maya». Современные голоса и права живых сообществ не заменяются древним текстом. [Newberry] [Multepal] Перед возможной публикацией следует дополнительно сверить написания K’iche’ имён и терминов с квалифицированным специалистом или носителем языка.</w:t>
-      </w:r>
-    </w:p>
-    <w:p>
       <w:pPr>
         <w:pStyle w:val="Heading1"/>
         <w:spacing w:before="100" w:after="220"/>
@@ -285,6 +275,24 @@
           <w:sz w:val="21"/>
         </w:rPr>
         <w:t>Оглавление</w:t>
+      </w:r>
+    </w:p>
+    <w:p>
+      <w:pPr>
+        <w:ind w:left="397" w:right="283" w:firstLine="0"/>
+        <w:shd w:fill="F0EDF3"/>
+        <w:pBdr>
+          <w:left w:val="single" w:sz="18" w:space="8" w:color="624B7D"/>
+        </w:pBdr>
+      </w:pPr>
+      <w:r>
+        <w:rPr>
+          <w:rFonts w:ascii="Noto Serif" w:hAnsi="Noto Serif" w:eastAsia="Noto Serif"/>
+          <w:i/>
+          <w:color w:val="252B42"/>
+          <w:sz w:val="21"/>
+        </w:rPr>
+        <w:t>К Popol Wuj относятся с глубоким уважением многие K’iche’ и другие Maya люди. Поэтому здесь нет инструкций, реконструкций закрытых обрядов или претензии объяснить одну «религию Maya». Современные голоса и права живых сообществ не заменяются древним текстом. [Newberry] [Multepal] Перед возможной публикацией следует дополнительно сверить написания K’iche’ имён и терминов с квалифицированным специалистом или носителем языка.</w:t>
       </w:r>
     </w:p>
     <w:p>
@@ -560,7 +568,7 @@
       <w:r>
         <w:drawing>
           <wp:inline xmlns:a="http://schemas.openxmlformats.org/drawingml/2006/main" xmlns:pic="http://schemas.openxmlformats.org/drawingml/2006/picture">
-            <wp:extent cx="4914000" cy="3276000"/>
+            <wp:extent cx="2700000" cy="1800000"/>
             <wp:docPr id="2" name="Picture 2" descr="Авторская визуализация первой земли и животных; это не реконструкция древнего изображения" title="creation"/>
             <wp:cNvGraphicFramePr>
               <a:graphicFrameLocks noChangeAspect="1"/>
@@ -581,7 +589,7 @@
                   <pic:spPr>
                     <a:xfrm>
                       <a:off x="0" y="0"/>
-                      <a:ext cx="4914000" cy="3276000"/>
+                      <a:ext cx="2700000" cy="1800000"/>
                     </a:xfrm>
                     <a:prstGeom prst="rect"/>
                   </pic:spPr>

</xml_diff>